<commit_message>
Página web como sitio de producto, bitácora pública y limpieza de información interna
Co-Authored-By: Claude Sonnet 5.5 <noreply@anthropic.com>
Claude-Session: https://claude.ai/code/session_01WLZ2XuhTWTWujj27otXiLx
</commit_message>
<xml_diff>
--- a/docs/documentos/01 Acta de Inicio del proyecto.docx
+++ b/docs/documentos/01 Acta de Inicio del proyecto.docx
@@ -249,7 +249,7 @@
           <w:i w:val="0"/>
           <w:sz w:val="24"/>
         </w:rPr>
-        <w:t>Este documento sigue la estructura del formato de acta de inicio entregado por el docente para 2026. Del ejemplo del formato solo se tomó la estructura; no se copiaron sus datos (código, presupuesto, fechas ni personas). La versión 2.0 reemplaza a la versión del 21 de agosto de 2026.</w:t>
+        <w:t>Este documento sigue el formato de acta de inicio de la asignatura para 2026. La versión 2.0 reemplaza a la versión del 21 de agosto de 2026.</w:t>
       </w:r>
     </w:p>
     <w:p>
@@ -2219,7 +2219,7 @@
                 <w:i w:val="0"/>
                 <w:sz w:val="20"/>
               </w:rPr>
-              <w:t>Reparto por roles revisado con el docente y registro de contribuciones.</w:t>
+              <w:t>Reparto por roles y registro de contribuciones.</w:t>
             </w:r>
           </w:p>
         </w:tc>
@@ -2549,7 +2549,7 @@
           <w:i w:val="0"/>
           <w:sz w:val="24"/>
         </w:rPr>
-        <w:t>Las decisiones de organización tomadas por el equipo y las indicaciones del docente se registran a continuación con la fecha que consta en la bitácora del proyecto.</w:t>
+        <w:t>Las decisiones de organización del proyecto se registran a continuación con la fecha que consta en la bitácora.</w:t>
       </w:r>
     </w:p>
     <w:p>
@@ -2745,7 +2745,7 @@
                 <w:i w:val="0"/>
                 <w:sz w:val="20"/>
               </w:rPr>
-              <w:t>Inicio formal del proyecto; el equipo elige C.I.S.P.P.H. entre las alternativas del docente.</w:t>
+              <w:t>Inicio formal del proyecto; el equipo elige C.I.S.P.P.H. entre las alternativas de la asignatura.</w:t>
             </w:r>
           </w:p>
         </w:tc>
@@ -2834,7 +2834,7 @@
                 <w:i w:val="0"/>
                 <w:sz w:val="20"/>
               </w:rPr>
-              <w:t>El docente pide integrar normativa, requisitos, actores, Product y Sprint Backlog, BPMN y mockups.</w:t>
+              <w:t>Se amplía el alcance con normativa, requisitos, actores, Product y Sprint Backlog, BPMN y mockups.</w:t>
             </w:r>
           </w:p>
         </w:tc>
@@ -3012,7 +3012,7 @@
                 <w:i w:val="0"/>
                 <w:sz w:val="20"/>
               </w:rPr>
-              <w:t>Trello con cuatro columnas (Lista de tareas, En proceso, Validando, Hecho); «Hecho» solo con validación del docente.</w:t>
+              <w:t>Trello con cuatro columnas (Lista de tareas, En proceso, Validando, Hecho); «Hecho» solo tras la validación del docente.</w:t>
             </w:r>
           </w:p>
         </w:tc>
@@ -3101,7 +3101,7 @@
                 <w:i w:val="0"/>
                 <w:sz w:val="20"/>
               </w:rPr>
-              <w:t>El docente entrega la Ruta Metodológica de nueve bloques.</w:t>
+              <w:t>Se adopta la Ruta Metodológica de nueve bloques.</w:t>
             </w:r>
           </w:p>
         </w:tc>
@@ -3218,7 +3218,7 @@
                 <w:i w:val="0"/>
                 <w:sz w:val="20"/>
               </w:rPr>
-              <w:t>Guía de entregables</w:t>
+              <w:t>Bitácora</w:t>
             </w:r>
           </w:p>
         </w:tc>
@@ -3576,7 +3576,7 @@
                 <w:i w:val="0"/>
                 <w:sz w:val="20"/>
               </w:rPr>
-              <w:t>Versión inicial adaptada al formato del docente.</w:t>
+              <w:t>Versión inicial adaptada al formato de la asignatura.</w:t>
             </w:r>
           </w:p>
         </w:tc>

</xml_diff>